<commit_message>
Update location to Santa Maria, Bulacan, Philippines
</commit_message>
<xml_diff>
--- a/public/downloads/Sean_Villanueva_Resume.docx
+++ b/public/downloads/Sean_Villanueva_Resume.docx
@@ -44,7 +44,9 @@
         <w:rPr>
           <w:rFonts w:ascii="Arial" w:cs="Arial" w:eastAsia="Arial" w:hAnsi="Arial"/>
         </w:rPr>
-        <w:t xml:space="preserve">Bulacan, Philippines   |   09472401814   |   villanuevasean0918@gmail.com</w:t>
+        <w:t xml:space="preserve">Santa Maria, Bulacan, Philippines</w:t>
+        <w:br/>
+        <w:t>09472401814   |   villanuevasean0918@gmail.com</w:t>
       </w:r>
     </w:p>
     <w:p>

</xml_diff>